<commit_message>
Phase2 privacy layer (#4)
* Feedback form updated

* Point editor in progress

* Major interface enhancement

* Phase1 validator split (#3)

* Split and generalize the legacy checker

* clean-up

* Validators split done

* PrivacyService added

* Privacy layer done (untested)

---------

Co-authored-by: Olga Glazunova <o.glazunova@tue.nl>
</commit_message>
<xml_diff>
--- a/docs/pilot_feedback_template.docx
+++ b/docs/pilot_feedback_template.docx
@@ -53,18 +53,99 @@
     </w:p>
     <w:p>
       <w:r>
-        <w:t>1. What is your role?</w:t>
+        <w:t>1.</w:t>
+      </w:r>
+      <w:r>
+        <w:t>1 What is your role</w:t>
+      </w:r>
+      <w:r>
+        <w:t xml:space="preserve"> in the project</w:t>
+      </w:r>
+      <w:r>
+        <w:t>?</w:t>
       </w:r>
     </w:p>
     <w:p>
       <w:r>
-        <w:t>2. Which campaign</w:t>
+        <w:t>1.</w:t>
       </w:r>
       <w:r>
-        <w:t>(s)</w:t>
+        <w:t>2</w:t>
       </w:r>
       <w:r>
-        <w:t xml:space="preserve"> did you test?</w:t>
+        <w:t xml:space="preserve"> Which features did you use?</w:t>
+      </w:r>
+    </w:p>
+    <w:p>
+      <w:pPr>
+        <w:pStyle w:val="ListParagraph"/>
+        <w:numPr>
+          <w:ilvl w:val="0"/>
+          <w:numId w:val="10"/>
+        </w:numPr>
+      </w:pPr>
+      <w:r>
+        <w:t>Upload and checking</w:t>
+      </w:r>
+    </w:p>
+    <w:p>
+      <w:pPr>
+        <w:pStyle w:val="ListParagraph"/>
+        <w:numPr>
+          <w:ilvl w:val="0"/>
+          <w:numId w:val="10"/>
+        </w:numPr>
+      </w:pPr>
+      <w:r>
+        <w:t>Chat questions</w:t>
+      </w:r>
+    </w:p>
+    <w:p>
+      <w:pPr>
+        <w:pStyle w:val="ListParagraph"/>
+        <w:numPr>
+          <w:ilvl w:val="0"/>
+          <w:numId w:val="10"/>
+        </w:numPr>
+      </w:pPr>
+      <w:r>
+        <w:t>Prioritization</w:t>
+      </w:r>
+    </w:p>
+    <w:p>
+      <w:pPr>
+        <w:pStyle w:val="ListParagraph"/>
+        <w:numPr>
+          <w:ilvl w:val="0"/>
+          <w:numId w:val="10"/>
+        </w:numPr>
+      </w:pPr>
+      <w:r>
+        <w:t>TTM explanations</w:t>
+      </w:r>
+    </w:p>
+    <w:p>
+      <w:pPr>
+        <w:pStyle w:val="ListParagraph"/>
+        <w:numPr>
+          <w:ilvl w:val="0"/>
+          <w:numId w:val="10"/>
+        </w:numPr>
+      </w:pPr>
+      <w:r>
+        <w:t>Excel export</w:t>
+      </w:r>
+    </w:p>
+    <w:p>
+      <w:pPr>
+        <w:pStyle w:val="ListParagraph"/>
+        <w:numPr>
+          <w:ilvl w:val="0"/>
+          <w:numId w:val="10"/>
+        </w:numPr>
+      </w:pPr>
+      <w:r>
+        <w:t>Other: ______</w:t>
       </w:r>
     </w:p>
     <w:p>
@@ -72,26 +153,25 @@
         <w:pStyle w:val="Heading1"/>
       </w:pPr>
       <w:r>
-        <w:t>2. Usage</w:t>
+        <w:t>2. Usa</w:t>
+      </w:r>
+      <w:r>
+        <w:t>bility</w:t>
       </w:r>
     </w:p>
     <w:p>
       <w:r>
-        <w:t>3. How did you load the campaign?</w:t>
-      </w:r>
-      <w:r>
-        <w:t xml:space="preserve"> </w:t>
+        <w:t>2.1 The app was easy to use. [1–5]</w:t>
       </w:r>
     </w:p>
     <w:p>
       <w:r>
-        <w:t xml:space="preserve">4. </w:t>
+        <w:t>2.2 The interface was clear. [1–5]</w:t>
       </w:r>
+    </w:p>
+    <w:p>
       <w:r>
-        <w:t>Was the app easy to use</w:t>
-      </w:r>
-      <w:r>
-        <w:t xml:space="preserve">? </w:t>
+        <w:t>2.3 Which parts of the interface should be improved or added?</w:t>
       </w:r>
     </w:p>
     <w:p>
@@ -104,29 +184,32 @@
     </w:p>
     <w:p>
       <w:r>
-        <w:t>5. Were the detected issues understandable?</w:t>
-      </w:r>
-      <w:r>
-        <w:t xml:space="preserve"> </w:t>
+        <w:t>3.1 The detected issues were understandable. [1–5]</w:t>
       </w:r>
     </w:p>
     <w:p>
       <w:r>
-        <w:t>6. Did the assistant correctly identify important problems?</w:t>
-      </w:r>
-      <w:r>
-        <w:t xml:space="preserve"> </w:t>
+        <w:t>3.2 The detected issues were correct. [1–5]</w:t>
       </w:r>
     </w:p>
     <w:p>
       <w:r>
-        <w:t xml:space="preserve">7. </w:t>
+        <w:t>3.3 The assistant identified the most important problems. [1–5]</w:t>
       </w:r>
+    </w:p>
+    <w:p>
       <w:r>
-        <w:t>Did the prioritization of issues seem reasonable</w:t>
+        <w:t>3.4 The prioritization of issues seemed reasonable. [1–5]</w:t>
       </w:r>
+    </w:p>
+    <w:p>
       <w:r>
-        <w:t>?</w:t>
+        <w:t>3.5 Which checks were most valuable?</w:t>
+      </w:r>
+    </w:p>
+    <w:p>
+      <w:r>
+        <w:t>3.6 Which important problems were missing?</w:t>
       </w:r>
     </w:p>
     <w:p>
@@ -139,15 +222,22 @@
     </w:p>
     <w:p>
       <w:r>
-        <w:t>8. Was the chat interface useful for understanding the issues?</w:t>
-      </w:r>
-      <w:r>
-        <w:t xml:space="preserve"> </w:t>
+        <w:t>4.1 The chat interface helped me understand the issues. [1–5]</w:t>
       </w:r>
     </w:p>
     <w:p>
       <w:r>
-        <w:t>9. What question did you ask that was most useful?</w:t>
+        <w:t>4.2 The chat responses were clear. [1–5]</w:t>
+      </w:r>
+    </w:p>
+    <w:p>
+      <w:r>
+        <w:t>4.3 What question did you ask that was most useful?</w:t>
+      </w:r>
+    </w:p>
+    <w:p>
+      <w:r>
+        <w:t>4.4 What kind of question did the assistant not answer well?</w:t>
       </w:r>
     </w:p>
     <w:p>
@@ -155,12 +245,117 @@
         <w:pStyle w:val="Heading1"/>
       </w:pPr>
       <w:r>
+        <w:lastRenderedPageBreak/>
         <w:t>5. Value</w:t>
+      </w:r>
+      <w:r>
+        <w:t xml:space="preserve"> for Workflow</w:t>
       </w:r>
     </w:p>
     <w:p>
       <w:r>
-        <w:t>10. Would this tool save you time in campaign setup?</w:t>
+        <w:t>5.1 This tool would save me time in campaign setup/checking. [1–5]</w:t>
+      </w:r>
+    </w:p>
+    <w:p>
+      <w:r>
+        <w:t>5.2 This tool could improve my workflow. [1–5]</w:t>
+      </w:r>
+    </w:p>
+    <w:p>
+      <w:r>
+        <w:t>5.3 Compared with the current workflow, this tool is:</w:t>
+      </w:r>
+    </w:p>
+    <w:p>
+      <w:pPr>
+        <w:pStyle w:val="ListParagraph"/>
+        <w:numPr>
+          <w:ilvl w:val="0"/>
+          <w:numId w:val="11"/>
+        </w:numPr>
+      </w:pPr>
+      <w:r>
+        <w:t>much worse</w:t>
+      </w:r>
+    </w:p>
+    <w:p>
+      <w:pPr>
+        <w:pStyle w:val="ListParagraph"/>
+        <w:numPr>
+          <w:ilvl w:val="0"/>
+          <w:numId w:val="11"/>
+        </w:numPr>
+      </w:pPr>
+      <w:r>
+        <w:t>worse</w:t>
+      </w:r>
+    </w:p>
+    <w:p>
+      <w:pPr>
+        <w:pStyle w:val="ListParagraph"/>
+        <w:numPr>
+          <w:ilvl w:val="0"/>
+          <w:numId w:val="11"/>
+        </w:numPr>
+      </w:pPr>
+      <w:r>
+        <w:t>about the same</w:t>
+      </w:r>
+    </w:p>
+    <w:p>
+      <w:pPr>
+        <w:pStyle w:val="ListParagraph"/>
+        <w:numPr>
+          <w:ilvl w:val="0"/>
+          <w:numId w:val="11"/>
+        </w:numPr>
+      </w:pPr>
+      <w:r>
+        <w:t>better</w:t>
+      </w:r>
+    </w:p>
+    <w:p>
+      <w:pPr>
+        <w:pStyle w:val="ListParagraph"/>
+        <w:numPr>
+          <w:ilvl w:val="0"/>
+          <w:numId w:val="11"/>
+        </w:numPr>
+      </w:pPr>
+      <w:r>
+        <w:t>much better</w:t>
+      </w:r>
+    </w:p>
+    <w:p>
+      <w:r>
+        <w:t xml:space="preserve">5.4 Please explain your answer briefly. </w:t>
+      </w:r>
+    </w:p>
+    <w:p>
+      <w:pPr>
+        <w:pStyle w:val="Heading1"/>
+      </w:pPr>
+      <w:r>
+        <w:t xml:space="preserve">6. </w:t>
+      </w:r>
+      <w:r>
+        <w:t>Trust and Use</w:t>
+      </w:r>
+    </w:p>
+    <w:p>
+      <w:r>
+        <w:t>6.1 I would use this tool again during campaign preparation. [1–5]</w:t>
+      </w:r>
+    </w:p>
+    <w:p>
+      <w:r>
+        <w:t>6.2 I would trust this tool to support campaign checking. [1–5]</w:t>
+      </w:r>
+    </w:p>
+    <w:p>
+      <w:r>
+        <w:t>6.3 Human review is necessary before acting on the results. [1–5]</w:t>
       </w:r>
       <w:r>
         <w:t xml:space="preserve"> </w:t>
@@ -171,12 +366,23 @@
         <w:pStyle w:val="Heading1"/>
       </w:pPr>
       <w:r>
-        <w:t>6. Issues</w:t>
+        <w:t>7</w:t>
+      </w:r>
+      <w:r>
+        <w:t>. Issues</w:t>
       </w:r>
     </w:p>
     <w:p>
       <w:r>
-        <w:t>11. Did you encounter any bugs or incorrect results?</w:t>
+        <w:t>7.1 Did you encounter any bugs or incorrect results</w:t>
+      </w:r>
+      <w:r>
+        <w:t>?</w:t>
+      </w:r>
+    </w:p>
+    <w:p>
+      <w:r>
+        <w:t xml:space="preserve">7.2 Was anything unclear or missing? </w:t>
       </w:r>
     </w:p>
     <w:p>
@@ -184,23 +390,42 @@
         <w:pStyle w:val="Heading1"/>
       </w:pPr>
       <w:r>
-        <w:t>7. Improvement</w:t>
+        <w:t>8</w:t>
+      </w:r>
+      <w:r>
+        <w:t>. Improvement</w:t>
       </w:r>
     </w:p>
     <w:p>
       <w:r>
-        <w:t>12. What is the ONE most important improvement for the next version?</w:t>
+        <w:t>8</w:t>
       </w:r>
       <w:r>
-        <w:br/>
+        <w:t>.1</w:t>
       </w:r>
       <w:r>
-        <w:br/>
+        <w:t xml:space="preserve"> </w:t>
+      </w:r>
+      <w:r>
+        <w:t xml:space="preserve">What is the </w:t>
+      </w:r>
+      <w:r>
+        <w:rPr>
+          <w:b/>
+          <w:bCs/>
+        </w:rPr>
+        <w:t>one most important improvement</w:t>
+      </w:r>
+      <w:r>
+        <w:t xml:space="preserve"> for the next version</w:t>
+      </w:r>
+      <w:r>
+        <w:t>?</w:t>
       </w:r>
     </w:p>
     <w:sectPr>
       <w:pgSz w:w="12240" w:h="15840"/>
-      <w:pgMar w:top="1440" w:right="1800" w:bottom="1440" w:left="1800" w:header="720" w:footer="720" w:gutter="0"/>
+      <w:pgMar w:top="851" w:right="1440" w:bottom="1134" w:left="1440" w:header="720" w:footer="720" w:gutter="0"/>
       <w:cols w:space="720"/>
       <w:docGrid w:linePitch="360"/>
     </w:sectPr>
@@ -381,6 +606,232 @@
       </w:rPr>
     </w:lvl>
   </w:abstractNum>
+  <w:abstractNum w:abstractNumId="9" w15:restartNumberingAfterBreak="0">
+    <w:nsid w:val="06A50AEF"/>
+    <w:multiLevelType w:val="hybridMultilevel"/>
+    <w:tmpl w:val="4F7CDE14"/>
+    <w:lvl w:ilvl="0" w:tplc="0C000001">
+      <w:start w:val="1"/>
+      <w:numFmt w:val="bullet"/>
+      <w:lvlText w:val=""/>
+      <w:lvlJc w:val="left"/>
+      <w:pPr>
+        <w:ind w:left="720" w:hanging="360"/>
+      </w:pPr>
+      <w:rPr>
+        <w:rFonts w:ascii="Symbol" w:hAnsi="Symbol" w:hint="default"/>
+      </w:rPr>
+    </w:lvl>
+    <w:lvl w:ilvl="1" w:tplc="0C000003" w:tentative="1">
+      <w:start w:val="1"/>
+      <w:numFmt w:val="bullet"/>
+      <w:lvlText w:val="o"/>
+      <w:lvlJc w:val="left"/>
+      <w:pPr>
+        <w:ind w:left="1440" w:hanging="360"/>
+      </w:pPr>
+      <w:rPr>
+        <w:rFonts w:ascii="Courier New" w:hAnsi="Courier New" w:cs="Courier New" w:hint="default"/>
+      </w:rPr>
+    </w:lvl>
+    <w:lvl w:ilvl="2" w:tplc="0C000005" w:tentative="1">
+      <w:start w:val="1"/>
+      <w:numFmt w:val="bullet"/>
+      <w:lvlText w:val=""/>
+      <w:lvlJc w:val="left"/>
+      <w:pPr>
+        <w:ind w:left="2160" w:hanging="360"/>
+      </w:pPr>
+      <w:rPr>
+        <w:rFonts w:ascii="Wingdings" w:hAnsi="Wingdings" w:hint="default"/>
+      </w:rPr>
+    </w:lvl>
+    <w:lvl w:ilvl="3" w:tplc="0C000001" w:tentative="1">
+      <w:start w:val="1"/>
+      <w:numFmt w:val="bullet"/>
+      <w:lvlText w:val=""/>
+      <w:lvlJc w:val="left"/>
+      <w:pPr>
+        <w:ind w:left="2880" w:hanging="360"/>
+      </w:pPr>
+      <w:rPr>
+        <w:rFonts w:ascii="Symbol" w:hAnsi="Symbol" w:hint="default"/>
+      </w:rPr>
+    </w:lvl>
+    <w:lvl w:ilvl="4" w:tplc="0C000003" w:tentative="1">
+      <w:start w:val="1"/>
+      <w:numFmt w:val="bullet"/>
+      <w:lvlText w:val="o"/>
+      <w:lvlJc w:val="left"/>
+      <w:pPr>
+        <w:ind w:left="3600" w:hanging="360"/>
+      </w:pPr>
+      <w:rPr>
+        <w:rFonts w:ascii="Courier New" w:hAnsi="Courier New" w:cs="Courier New" w:hint="default"/>
+      </w:rPr>
+    </w:lvl>
+    <w:lvl w:ilvl="5" w:tplc="0C000005" w:tentative="1">
+      <w:start w:val="1"/>
+      <w:numFmt w:val="bullet"/>
+      <w:lvlText w:val=""/>
+      <w:lvlJc w:val="left"/>
+      <w:pPr>
+        <w:ind w:left="4320" w:hanging="360"/>
+      </w:pPr>
+      <w:rPr>
+        <w:rFonts w:ascii="Wingdings" w:hAnsi="Wingdings" w:hint="default"/>
+      </w:rPr>
+    </w:lvl>
+    <w:lvl w:ilvl="6" w:tplc="0C000001" w:tentative="1">
+      <w:start w:val="1"/>
+      <w:numFmt w:val="bullet"/>
+      <w:lvlText w:val=""/>
+      <w:lvlJc w:val="left"/>
+      <w:pPr>
+        <w:ind w:left="5040" w:hanging="360"/>
+      </w:pPr>
+      <w:rPr>
+        <w:rFonts w:ascii="Symbol" w:hAnsi="Symbol" w:hint="default"/>
+      </w:rPr>
+    </w:lvl>
+    <w:lvl w:ilvl="7" w:tplc="0C000003" w:tentative="1">
+      <w:start w:val="1"/>
+      <w:numFmt w:val="bullet"/>
+      <w:lvlText w:val="o"/>
+      <w:lvlJc w:val="left"/>
+      <w:pPr>
+        <w:ind w:left="5760" w:hanging="360"/>
+      </w:pPr>
+      <w:rPr>
+        <w:rFonts w:ascii="Courier New" w:hAnsi="Courier New" w:cs="Courier New" w:hint="default"/>
+      </w:rPr>
+    </w:lvl>
+    <w:lvl w:ilvl="8" w:tplc="0C000005" w:tentative="1">
+      <w:start w:val="1"/>
+      <w:numFmt w:val="bullet"/>
+      <w:lvlText w:val=""/>
+      <w:lvlJc w:val="left"/>
+      <w:pPr>
+        <w:ind w:left="6480" w:hanging="360"/>
+      </w:pPr>
+      <w:rPr>
+        <w:rFonts w:ascii="Wingdings" w:hAnsi="Wingdings" w:hint="default"/>
+      </w:rPr>
+    </w:lvl>
+  </w:abstractNum>
+  <w:abstractNum w:abstractNumId="10" w15:restartNumberingAfterBreak="0">
+    <w:nsid w:val="0E2B4030"/>
+    <w:multiLevelType w:val="hybridMultilevel"/>
+    <w:tmpl w:val="78CEE384"/>
+    <w:lvl w:ilvl="0" w:tplc="0C000001">
+      <w:start w:val="1"/>
+      <w:numFmt w:val="bullet"/>
+      <w:lvlText w:val=""/>
+      <w:lvlJc w:val="left"/>
+      <w:pPr>
+        <w:ind w:left="720" w:hanging="360"/>
+      </w:pPr>
+      <w:rPr>
+        <w:rFonts w:ascii="Symbol" w:hAnsi="Symbol" w:hint="default"/>
+      </w:rPr>
+    </w:lvl>
+    <w:lvl w:ilvl="1" w:tplc="0C000003" w:tentative="1">
+      <w:start w:val="1"/>
+      <w:numFmt w:val="bullet"/>
+      <w:lvlText w:val="o"/>
+      <w:lvlJc w:val="left"/>
+      <w:pPr>
+        <w:ind w:left="1440" w:hanging="360"/>
+      </w:pPr>
+      <w:rPr>
+        <w:rFonts w:ascii="Courier New" w:hAnsi="Courier New" w:cs="Courier New" w:hint="default"/>
+      </w:rPr>
+    </w:lvl>
+    <w:lvl w:ilvl="2" w:tplc="0C000005" w:tentative="1">
+      <w:start w:val="1"/>
+      <w:numFmt w:val="bullet"/>
+      <w:lvlText w:val=""/>
+      <w:lvlJc w:val="left"/>
+      <w:pPr>
+        <w:ind w:left="2160" w:hanging="360"/>
+      </w:pPr>
+      <w:rPr>
+        <w:rFonts w:ascii="Wingdings" w:hAnsi="Wingdings" w:hint="default"/>
+      </w:rPr>
+    </w:lvl>
+    <w:lvl w:ilvl="3" w:tplc="0C000001" w:tentative="1">
+      <w:start w:val="1"/>
+      <w:numFmt w:val="bullet"/>
+      <w:lvlText w:val=""/>
+      <w:lvlJc w:val="left"/>
+      <w:pPr>
+        <w:ind w:left="2880" w:hanging="360"/>
+      </w:pPr>
+      <w:rPr>
+        <w:rFonts w:ascii="Symbol" w:hAnsi="Symbol" w:hint="default"/>
+      </w:rPr>
+    </w:lvl>
+    <w:lvl w:ilvl="4" w:tplc="0C000003" w:tentative="1">
+      <w:start w:val="1"/>
+      <w:numFmt w:val="bullet"/>
+      <w:lvlText w:val="o"/>
+      <w:lvlJc w:val="left"/>
+      <w:pPr>
+        <w:ind w:left="3600" w:hanging="360"/>
+      </w:pPr>
+      <w:rPr>
+        <w:rFonts w:ascii="Courier New" w:hAnsi="Courier New" w:cs="Courier New" w:hint="default"/>
+      </w:rPr>
+    </w:lvl>
+    <w:lvl w:ilvl="5" w:tplc="0C000005" w:tentative="1">
+      <w:start w:val="1"/>
+      <w:numFmt w:val="bullet"/>
+      <w:lvlText w:val=""/>
+      <w:lvlJc w:val="left"/>
+      <w:pPr>
+        <w:ind w:left="4320" w:hanging="360"/>
+      </w:pPr>
+      <w:rPr>
+        <w:rFonts w:ascii="Wingdings" w:hAnsi="Wingdings" w:hint="default"/>
+      </w:rPr>
+    </w:lvl>
+    <w:lvl w:ilvl="6" w:tplc="0C000001" w:tentative="1">
+      <w:start w:val="1"/>
+      <w:numFmt w:val="bullet"/>
+      <w:lvlText w:val=""/>
+      <w:lvlJc w:val="left"/>
+      <w:pPr>
+        <w:ind w:left="5040" w:hanging="360"/>
+      </w:pPr>
+      <w:rPr>
+        <w:rFonts w:ascii="Symbol" w:hAnsi="Symbol" w:hint="default"/>
+      </w:rPr>
+    </w:lvl>
+    <w:lvl w:ilvl="7" w:tplc="0C000003" w:tentative="1">
+      <w:start w:val="1"/>
+      <w:numFmt w:val="bullet"/>
+      <w:lvlText w:val="o"/>
+      <w:lvlJc w:val="left"/>
+      <w:pPr>
+        <w:ind w:left="5760" w:hanging="360"/>
+      </w:pPr>
+      <w:rPr>
+        <w:rFonts w:ascii="Courier New" w:hAnsi="Courier New" w:cs="Courier New" w:hint="default"/>
+      </w:rPr>
+    </w:lvl>
+    <w:lvl w:ilvl="8" w:tplc="0C000005" w:tentative="1">
+      <w:start w:val="1"/>
+      <w:numFmt w:val="bullet"/>
+      <w:lvlText w:val=""/>
+      <w:lvlJc w:val="left"/>
+      <w:pPr>
+        <w:ind w:left="6480" w:hanging="360"/>
+      </w:pPr>
+      <w:rPr>
+        <w:rFonts w:ascii="Wingdings" w:hAnsi="Wingdings" w:hint="default"/>
+      </w:rPr>
+    </w:lvl>
+  </w:abstractNum>
   <w:num w:numId="1" w16cid:durableId="1364938811">
     <w:abstractNumId w:val="8"/>
   </w:num>
@@ -407,6 +858,12 @@
   </w:num>
   <w:num w:numId="9" w16cid:durableId="2115050996">
     <w:abstractNumId w:val="0"/>
+  </w:num>
+  <w:num w:numId="10" w16cid:durableId="1975014729">
+    <w:abstractNumId w:val="10"/>
+  </w:num>
+  <w:num w:numId="11" w16cid:durableId="165949239">
+    <w:abstractNumId w:val="9"/>
   </w:num>
 </w:numbering>
 </file>

</xml_diff>